<commit_message>
Simby: Backend integration update
</commit_message>
<xml_diff>
--- a/src/assets/docx/reference.docx
+++ b/src/assets/docx/reference.docx
@@ -1005,9 +1005,16 @@
     <w:name w:val="Hyperlink"/>
     <w:basedOn w:val="BodyTextChar"/>
     <w:rPr>
-      <w:color w:val="auto"/>
+      <w:color w:val="0563C1"/>
+      <w:u w:val="single"/>
+    </w:rPr>
+  </w:style>
+  <w:style w:type="character" w:styleId="CitationLink">
+    <w:name w:val="CitationLink"/>
+    <w:basedOn w:val="BodyTextChar"/>
+    <w:rPr>
+      <w:color w:val="000000"/>
       <w:u w:val="none"/>
-      <w:color w:val="4F81BD" w:themeColor="accent1"/>
     </w:rPr>
   </w:style>
   <w:style w:type="paragraph" w:styleId="TOCHeading">

</xml_diff>